<commit_message>
Updated all the files to the current
Updated all the files to the current just need to finish the documentation!
</commit_message>
<xml_diff>
--- a/AI Usage Statements/Team2_SoftwareEngineering_Project_SDD_AI_Usage_Statement.docx
+++ b/AI Usage Statements/Team2_SoftwareEngineering_Project_SDD_AI_Usage_Statement.docx
@@ -24,21 +24,7 @@
         <w:rPr>
           <w:rFonts w:ascii="Times New Roman" w:hAnsi="Times New Roman" w:cs="Times New Roman"/>
         </w:rPr>
-        <w:t xml:space="preserve">Jorge </w:t>
-      </w:r>
-      <w:proofErr w:type="spellStart"/>
-      <w:r>
-        <w:rPr>
-          <w:rFonts w:ascii="Times New Roman" w:hAnsi="Times New Roman" w:cs="Times New Roman"/>
-        </w:rPr>
-        <w:t>Bautistsa</w:t>
-      </w:r>
-      <w:proofErr w:type="spellEnd"/>
-      <w:r>
-        <w:rPr>
-          <w:rFonts w:ascii="Times New Roman" w:hAnsi="Times New Roman" w:cs="Times New Roman"/>
-        </w:rPr>
-        <w:t xml:space="preserve">, Stephen Canavan, </w:t>
+        <w:t xml:space="preserve">Jorge Bautista, Stephen Canavan, </w:t>
       </w:r>
       <w:r>
         <w:rPr>
@@ -335,23 +321,7 @@
           <w:rFonts w:ascii="Times New Roman" w:hAnsi="Times New Roman" w:cs="Times New Roman"/>
           <w:bCs/>
         </w:rPr>
-        <w:t xml:space="preserve"> the </w:t>
-      </w:r>
-      <w:proofErr w:type="gramStart"/>
-      <w:r>
-        <w:rPr>
-          <w:rFonts w:ascii="Times New Roman" w:hAnsi="Times New Roman" w:cs="Times New Roman"/>
-          <w:bCs/>
-        </w:rPr>
-        <w:t>requirements</w:t>
-      </w:r>
-      <w:proofErr w:type="gramEnd"/>
-      <w:r>
-        <w:rPr>
-          <w:rFonts w:ascii="Times New Roman" w:hAnsi="Times New Roman" w:cs="Times New Roman"/>
-          <w:bCs/>
-        </w:rPr>
-        <w:t xml:space="preserve"> and no sections or key information was forgotten.</w:t>
+        <w:t xml:space="preserve"> the requirements and no sections or key information was forgotten.</w:t>
       </w:r>
       <w:r>
         <w:rPr>
@@ -1735,11 +1705,12 @@
 </file>
 
 <file path=customXml/item1.xml><?xml version="1.0" encoding="utf-8"?>
-<p:properties xmlns:p="http://schemas.microsoft.com/office/2006/metadata/properties" xmlns:xsi="http://www.w3.org/2001/XMLSchema-instance" xmlns:pc="http://schemas.microsoft.com/office/infopath/2007/PartnerControls">
-  <documentManagement>
-    <_activity xmlns="61301d3d-a18e-49a5-b65a-3c33f30a2fbc" xsi:nil="true"/>
-  </documentManagement>
-</p:properties>
+<?mso-contentType ?>
+<FormTemplates xmlns="http://schemas.microsoft.com/sharepoint/v3/contenttype/forms">
+  <Display>DocumentLibraryForm</Display>
+  <Edit>DocumentLibraryForm</Edit>
+  <New>DocumentLibraryForm</New>
+</FormTemplates>
 </file>
 
 <file path=customXml/item2.xml><?xml version="1.0" encoding="utf-8"?>
@@ -1976,20 +1947,17 @@
 </file>
 
 <file path=customXml/item3.xml><?xml version="1.0" encoding="utf-8"?>
-<?mso-contentType ?>
-<FormTemplates xmlns="http://schemas.microsoft.com/sharepoint/v3/contenttype/forms">
-  <Display>DocumentLibraryForm</Display>
-  <Edit>DocumentLibraryForm</Edit>
-  <New>DocumentLibraryForm</New>
-</FormTemplates>
+<p:properties xmlns:p="http://schemas.microsoft.com/office/2006/metadata/properties" xmlns:xsi="http://www.w3.org/2001/XMLSchema-instance" xmlns:pc="http://schemas.microsoft.com/office/infopath/2007/PartnerControls">
+  <documentManagement>
+    <_activity xmlns="61301d3d-a18e-49a5-b65a-3c33f30a2fbc" xsi:nil="true"/>
+  </documentManagement>
+</p:properties>
 </file>
 
 <file path=customXml/itemProps1.xml><?xml version="1.0" encoding="utf-8"?>
-<ds:datastoreItem xmlns:ds="http://schemas.openxmlformats.org/officeDocument/2006/customXml" ds:itemID="{9C1ADE41-87A2-495E-91FB-F8DCE5A6F011}">
+<ds:datastoreItem xmlns:ds="http://schemas.openxmlformats.org/officeDocument/2006/customXml" ds:itemID="{4FDF9C74-A8E3-49D6-B6D1-A3039FC821CC}">
   <ds:schemaRefs>
-    <ds:schemaRef ds:uri="http://schemas.microsoft.com/office/2006/metadata/properties"/>
-    <ds:schemaRef ds:uri="http://schemas.microsoft.com/office/infopath/2007/PartnerControls"/>
-    <ds:schemaRef ds:uri="61301d3d-a18e-49a5-b65a-3c33f30a2fbc"/>
+    <ds:schemaRef ds:uri="http://schemas.microsoft.com/sharepoint/v3/contenttype/forms"/>
   </ds:schemaRefs>
 </ds:datastoreItem>
 </file>
@@ -2014,9 +1982,11 @@
 </file>
 
 <file path=customXml/itemProps3.xml><?xml version="1.0" encoding="utf-8"?>
-<ds:datastoreItem xmlns:ds="http://schemas.openxmlformats.org/officeDocument/2006/customXml" ds:itemID="{4FDF9C74-A8E3-49D6-B6D1-A3039FC821CC}">
+<ds:datastoreItem xmlns:ds="http://schemas.openxmlformats.org/officeDocument/2006/customXml" ds:itemID="{9C1ADE41-87A2-495E-91FB-F8DCE5A6F011}">
   <ds:schemaRefs>
-    <ds:schemaRef ds:uri="http://schemas.microsoft.com/sharepoint/v3/contenttype/forms"/>
+    <ds:schemaRef ds:uri="http://schemas.microsoft.com/office/2006/metadata/properties"/>
+    <ds:schemaRef ds:uri="http://schemas.microsoft.com/office/infopath/2007/PartnerControls"/>
+    <ds:schemaRef ds:uri="61301d3d-a18e-49a5-b65a-3c33f30a2fbc"/>
   </ds:schemaRefs>
 </ds:datastoreItem>
 </file>
</xml_diff>